<commit_message>
Override Draft_008 with tense fixes; remove Draft_009
- Draft_008 overwritten in place with Verb Tense Matrix cleanups
- Draft_009 deleted per user instruction
- projects.md + decisions.md updated
</commit_message>
<xml_diff>
--- a/thesis/003_ThesisProposal_Draft_008.docx
+++ b/thesis/003_ThesisProposal_Draft_008.docx
@@ -1568,7 +1568,7 @@
           <w:i w:val="0"/>
           <w:sz w:val="22"/>
         </w:rPr>
-        <w:t>The study is delimited to complete English-language abstracts. Abstracts with significant Filipino code-switching are excluded to maintain linguistic consistency. Disciplinary classification follows the degree program under which each thesis was officially submitted, not the research topic, to ensure objective categorization. L2 proficiency is not measured as a variable. Where patterns suggest proficiency effects alongside disciplinary ones, this is noted as a limitation requiring future research with proficiency controls.</w:t>
+        <w:t>The study is delimited to complete English-language abstracts. Abstracts with significant Filipino code-switching are excluded to maintain linguistic consistency. Disciplinary classification followed the degree program under which each thesis was officially submitted, not the research topic, to ensure objective categorization. L2 proficiency is not measured as a variable. Where patterns suggest proficiency effects alongside disciplinary ones, this is noted as a limitation requiring future research with proficiency controls.</w:t>
       </w:r>
     </w:p>
     <w:p>
@@ -2308,7 +2308,7 @@
           <w:i w:val="0"/>
           <w:sz w:val="22"/>
         </w:rPr>
-        <w:t>Disproportionate stratified systematic sampling was used, with discipline as the stratification variable and fixed analytical targets per stratum to ensure equal representation regardless of population size. The target sample sizes were n=20 for Biology, n=20 for Veterinary Medicine, n=10 for Agriculture — Animal Science, and n=10 for Agriculture — Crop Science, totaling 60 abstracts. Within each stratum, a sampling interval k was calculated as k = N/n, where N is the stratum’s target pool size (theses completed 2023–2025) and n is the required sample size. The intervals were as follows: Biology k=7 (145÷20=7.25), Veterinary Medicine k=5 (104÷20=5.2), Animal Science k=4 (38÷10=3.8), and Crop Science k=9 (94÷10=9.4). Sampling began from a randomly selected position around the middle of each stratum’s catalog and proceeded forward by taking every kth thesis. Where the end of the stratum was reached before the required sample size, counting wrapped around to the beginning of the catalog and continued until the target sample was met. Disciplinary classification follows the degree program under which each thesis was officially submitted (e.g., B.S. Agriculture, B.S. Biology, D.V.M.), not research topic, to ensure objective categorization.</w:t>
+        <w:t>Disproportionate stratified systematic sampling was used, with discipline as the stratification variable and fixed analytical targets per stratum to ensure equal representation regardless of population size. The target sample sizes were n=20 for Biology, n=20 for Veterinary Medicine, n=10 for Agriculture — Animal Science, and n=10 for Agriculture — Crop Science, totaling 60 abstracts. Within each stratum, a sampling interval k was calculated as k = N/n, where N is the stratum’s target pool size (theses completed 2023–2025) and n is the required sample size. The intervals were as follows: Biology k=7 (145÷20=7.25), Veterinary Medicine k=5 (104÷20=5.2), Animal Science k=4 (38÷10=3.8), and Crop Science k=9 (94÷10=9.4). Sampling began from a randomly selected position around the middle of each stratum’s catalog and proceeded forward by taking every kth thesis. Where the end of the stratum was reached before the required sample size, counting wrapped around to the beginning of the catalog and continued until the target sample was met. Disciplinary classification followed the degree program under which each thesis was officially submitted (e.g., B.S. Agriculture, B.S. Biology, D.V.M.), not research topic, to ensure objective categorization.</w:t>
       </w:r>
     </w:p>
     <w:p>
@@ -2408,7 +2408,7 @@
           <w:i w:val="0"/>
           <w:sz w:val="22"/>
         </w:rPr>
-        <w:t>Permission and library access: 1 week. Corpus construction and on-site photography: 3 weeks. OCR verification and text preparation: 2 weeks. Pilot testing and coding finalization: 2 weeks. Full coding and frequency analysis: 8 weeks (approximately 10 hours per week). Writing and revision: 8 weeks. Total estimated timeframe: approximately 5.5 months (24 weeks).</w:t>
+        <w:t>Permission and library access: 1 week. Corpus construction and on-site photography: 3 weeks. OCR verification and text preparation: 2 weeks. Pilot testing and coding finalization: 2 weeks. Full coding and frequency analysis: 8 weeks (approximately 10 hours per week). Writing and revision: 8 weeks. Total timeframe: approximately 5.5 months (24 weeks).</w:t>
       </w:r>
     </w:p>
     <w:p>
@@ -3233,7 +3233,7 @@
           <w:i w:val="0"/>
           <w:sz w:val="22"/>
         </w:rPr>
-        <w:t>Abstracts were accessed on-site at the PSAU Library with proper authorization. Student names and thesis titles were fully anonymized using discipline codes (Acs1–A10, Aas1–A10, VM1–VM20, B1–B20) before analysis began. The study analyzed linguistic patterns in text, not student performance or personal information. All data files were stored on password-protected devices and encrypted cloud storage accessible only to the researcher and thesis adviser. These files are retained for five years to support verification of coding decisions by future researchers and to allow for follow-up comparative studies, after which they are permanently deleted in line with standard academic data retention practice.</w:t>
+        <w:t>Abstracts were accessed on-site at the PSAU Library with proper authorization. Student names and thesis titles were fully anonymized using discipline codes (Acs1–A10, Aas1–A10, VM1–VM20, B1–B20) before analysis began. The study analyzed linguistic patterns in text, not student performance or personal information. All data files were stored on password-protected devices and encrypted cloud storage accessible only to the researcher and thesis adviser. These files will be retained for five years to support verification of coding decisions by future researchers and to allow for follow-up comparative studies, after which they will be permanently deleted in line with standard academic data retention practice.</w:t>
       </w:r>
     </w:p>
     <w:p>

</xml_diff>